<commit_message>
cập nhật trang bài viết
</commit_message>
<xml_diff>
--- a/NHẬN XÉT CỦA GIÁO VIÊN HƯỚNG DẪN.docx
+++ b/NHẬN XÉT CỦA GIÁO VIÊN HƯỚNG DẪN.docx
@@ -901,6 +901,15 @@
     <w:p/>
     <w:p>
       <w:pPr>
+        <w:pStyle w:val="TieuDe"/>
+      </w:pPr>
+      <w:r>
+        <w:lastRenderedPageBreak/>
+        <w:t>LỜI CẢM ƠN</w:t>
+      </w:r>
+    </w:p>
+    <w:p>
+      <w:pPr>
         <w:spacing w:after="0" w:line="360" w:lineRule="auto"/>
         <w:ind w:firstLine="720"/>
         <w:jc w:val="both"/>
@@ -916,7 +925,6 @@
           <w:sz w:val="26"/>
           <w:szCs w:val="26"/>
         </w:rPr>
-        <w:lastRenderedPageBreak/>
         <w:t>Trong quá trình thực hiện đề</w:t>
       </w:r>
       <w:r>
@@ -933,7 +941,47 @@
           <w:sz w:val="26"/>
           <w:szCs w:val="26"/>
         </w:rPr>
-        <w:t>em đã nhận được rất nhiều sự giúp đỡ từ quý thầy cô, nhà trường, bạn bè và gia đình để em có thể hoàn thành đề tài này.</w:t>
+        <w:t>tôi</w:t>
+      </w:r>
+      <w:r>
+        <w:rPr>
+          <w:rFonts w:ascii="Times New Roman" w:hAnsi="Times New Roman" w:cs="Times New Roman"/>
+          <w:sz w:val="26"/>
+          <w:szCs w:val="26"/>
+        </w:rPr>
+        <w:t xml:space="preserve"> đã nhận được rất nhiều sự giúp đỡ từ quý thầ</w:t>
+      </w:r>
+      <w:r>
+        <w:rPr>
+          <w:rFonts w:ascii="Times New Roman" w:hAnsi="Times New Roman" w:cs="Times New Roman"/>
+          <w:sz w:val="26"/>
+          <w:szCs w:val="26"/>
+        </w:rPr>
+        <w:t>y (cô)</w:t>
+      </w:r>
+      <w:r>
+        <w:rPr>
+          <w:rFonts w:ascii="Times New Roman" w:hAnsi="Times New Roman" w:cs="Times New Roman"/>
+          <w:sz w:val="26"/>
+          <w:szCs w:val="26"/>
+        </w:rPr>
+        <w:t>, nhà trường, bạn bè và gia đình để</w:t>
+      </w:r>
+      <w:r>
+        <w:rPr>
+          <w:rFonts w:ascii="Times New Roman" w:hAnsi="Times New Roman" w:cs="Times New Roman"/>
+          <w:sz w:val="26"/>
+          <w:szCs w:val="26"/>
+        </w:rPr>
+        <w:t xml:space="preserve"> tôi</w:t>
+      </w:r>
+      <w:r>
+        <w:rPr>
+          <w:rFonts w:ascii="Times New Roman" w:hAnsi="Times New Roman" w:cs="Times New Roman"/>
+          <w:sz w:val="26"/>
+          <w:szCs w:val="26"/>
+        </w:rPr>
+        <w:t xml:space="preserve"> có thể hoàn thành đề tài này.</w:t>
       </w:r>
     </w:p>
     <w:p>
@@ -953,7 +1001,23 @@
           <w:sz w:val="26"/>
           <w:szCs w:val="26"/>
         </w:rPr>
-        <w:t xml:space="preserve">Đầu tiên, em xin chân thành cảm hơn đến thầy </w:t>
+        <w:t>Đầ</w:t>
+      </w:r>
+      <w:r>
+        <w:rPr>
+          <w:rFonts w:ascii="Times New Roman" w:hAnsi="Times New Roman" w:cs="Times New Roman"/>
+          <w:sz w:val="26"/>
+          <w:szCs w:val="26"/>
+        </w:rPr>
+        <w:t>u tiên, tôi</w:t>
+      </w:r>
+      <w:r>
+        <w:rPr>
+          <w:rFonts w:ascii="Times New Roman" w:hAnsi="Times New Roman" w:cs="Times New Roman"/>
+          <w:sz w:val="26"/>
+          <w:szCs w:val="26"/>
+        </w:rPr>
+        <w:t xml:space="preserve"> xin chân thành cảm hơn đến thầy </w:t>
       </w:r>
       <w:r>
         <w:rPr>
@@ -985,7 +1049,23 @@
           <w:sz w:val="26"/>
           <w:szCs w:val="26"/>
         </w:rPr>
-        <w:t>đã tận tình hướng dẫn, cung cấp cho em những kiến thức bổ ích và nền tảng quý giá trong suốt quá trình học tập và thực hiện đề tài.</w:t>
+        <w:t>đã tận tình hướng dẫn, cung cấ</w:t>
+      </w:r>
+      <w:r>
+        <w:rPr>
+          <w:rFonts w:ascii="Times New Roman" w:hAnsi="Times New Roman" w:cs="Times New Roman"/>
+          <w:sz w:val="26"/>
+          <w:szCs w:val="26"/>
+        </w:rPr>
+        <w:t>p cho tôi</w:t>
+      </w:r>
+      <w:r>
+        <w:rPr>
+          <w:rFonts w:ascii="Times New Roman" w:hAnsi="Times New Roman" w:cs="Times New Roman"/>
+          <w:sz w:val="26"/>
+          <w:szCs w:val="26"/>
+        </w:rPr>
+        <w:t xml:space="preserve"> những kiến thức bổ ích và nền tảng quý giá trong suốt quá trình học tập và thực hiện đề tài.</w:t>
       </w:r>
     </w:p>
     <w:p>
@@ -1004,14 +1084,14 @@
           <w:sz w:val="26"/>
           <w:szCs w:val="26"/>
         </w:rPr>
-        <w:t>E</w:t>
-      </w:r>
-      <w:r>
-        <w:rPr>
-          <w:sz w:val="26"/>
-          <w:szCs w:val="26"/>
-        </w:rPr>
-        <w:t>m xin gửi lời cảm ơn đến các anh chị, bạn bè và những người đã chia sẻ, đóng góp những ý kiến giúp</w:t>
+        <w:t>Tôi</w:t>
+      </w:r>
+      <w:r>
+        <w:rPr>
+          <w:sz w:val="26"/>
+          <w:szCs w:val="26"/>
+        </w:rPr>
+        <w:t xml:space="preserve"> xin gửi lời cảm ơn đến các anh chị, bạn bè và những người đã chia sẻ, đóng góp những ý kiến giúp</w:t>
       </w:r>
       <w:r>
         <w:rPr>
@@ -1025,7 +1105,14 @@
           <w:sz w:val="26"/>
           <w:szCs w:val="26"/>
         </w:rPr>
-        <w:t>em có thêm những trải nghiệm thực tế để hoàn thiện sản phẩm tốt hơn.</w:t>
+        <w:t>tôi</w:t>
+      </w:r>
+      <w:r>
+        <w:rPr>
+          <w:sz w:val="26"/>
+          <w:szCs w:val="26"/>
+        </w:rPr>
+        <w:t xml:space="preserve"> có thêm những trải nghiệm thực tế để hoàn thiện sản phẩm tốt hơn.</w:t>
       </w:r>
     </w:p>
     <w:p>
@@ -1044,7 +1131,28 @@
           <w:sz w:val="26"/>
           <w:szCs w:val="26"/>
         </w:rPr>
-        <w:t>Bên cạnh đó, em cũng gửi lời cảm ơn tới nhà trường, bạn bè và gia đình đã tạo điều kiện, hỗ trợ cả vật chất và tinh thần trong quá trình học tập và thực hiện đề tài. Chính sự quan tâm, giúp đỡ và khích lệ đó là động lực giúp em vượt qua những khó khăn thử thách trong quá trình thực hiện đề tài.</w:t>
+        <w:t>Bên cạnh đó, tôi</w:t>
+      </w:r>
+      <w:r>
+        <w:rPr>
+          <w:sz w:val="26"/>
+          <w:szCs w:val="26"/>
+        </w:rPr>
+        <w:t xml:space="preserve"> cũng gửi lời cảm ơn tới nhà trường, bạn bè và gia đình đã tạo điều kiện, hỗ trợ cả vật chất và tinh thần trong quá trình học tập và thực hiện đề tài. Chính sự quan tâm, giúp đỡ và</w:t>
+      </w:r>
+      <w:r>
+        <w:rPr>
+          <w:sz w:val="26"/>
+          <w:szCs w:val="26"/>
+        </w:rPr>
+        <w:t xml:space="preserve"> khích lệ đó là động lực giúp tôi</w:t>
+      </w:r>
+      <w:r>
+        <w:rPr>
+          <w:sz w:val="26"/>
+          <w:szCs w:val="26"/>
+        </w:rPr>
+        <w:t xml:space="preserve"> vượt qua những khó khăn thử thách trong quá trình thực hiện đề tài.</w:t>
       </w:r>
     </w:p>
     <w:p>
@@ -1063,14 +1171,37 @@
           <w:sz w:val="26"/>
           <w:szCs w:val="26"/>
         </w:rPr>
-        <w:t>E</w:t>
-      </w:r>
-      <w:r>
-        <w:rPr>
-          <w:sz w:val="26"/>
-          <w:szCs w:val="26"/>
-        </w:rPr>
-        <w:t>m rất mong nhận được những góp ý quý báu từ thầy và các bạn để có thể rút kinh nghiệm làm hành trang cho tương lại.</w:t>
+        <w:t>Tôi</w:t>
+      </w:r>
+      <w:r>
+        <w:rPr>
+          <w:sz w:val="26"/>
+          <w:szCs w:val="26"/>
+        </w:rPr>
+        <w:t xml:space="preserve"> rất mong nhận được những góp ý quý báu từ thầy</w:t>
+      </w:r>
+      <w:r>
+        <w:rPr>
+          <w:sz w:val="26"/>
+          <w:szCs w:val="26"/>
+        </w:rPr>
+        <w:t xml:space="preserve"> (cô</w:t>
+      </w:r>
+      <w:bookmarkStart w:id="5" w:name="_GoBack"/>
+      <w:bookmarkEnd w:id="5"/>
+      <w:r>
+        <w:rPr>
+          <w:sz w:val="26"/>
+          <w:szCs w:val="26"/>
+        </w:rPr>
+        <w:t>)</w:t>
+      </w:r>
+      <w:r>
+        <w:rPr>
+          <w:sz w:val="26"/>
+          <w:szCs w:val="26"/>
+        </w:rPr>
+        <w:t xml:space="preserve"> và các bạn để có thể rút kinh nghiệm làm hành trang cho tương lại.</w:t>
       </w:r>
     </w:p>
     <w:p>
@@ -1089,16 +1220,14 @@
           <w:sz w:val="26"/>
           <w:szCs w:val="26"/>
         </w:rPr>
-        <w:t>E</w:t>
-      </w:r>
-      <w:bookmarkStart w:id="5" w:name="_GoBack"/>
-      <w:bookmarkEnd w:id="5"/>
-      <w:r>
-        <w:rPr>
-          <w:sz w:val="26"/>
-          <w:szCs w:val="26"/>
-        </w:rPr>
-        <w:t>m xin chân thành cảm ơn!</w:t>
+        <w:t>Tôi</w:t>
+      </w:r>
+      <w:r>
+        <w:rPr>
+          <w:sz w:val="26"/>
+          <w:szCs w:val="26"/>
+        </w:rPr>
+        <w:t xml:space="preserve"> xin chân thành cảm ơn!</w:t>
       </w:r>
     </w:p>
     <w:p/>

</xml_diff>

<commit_message>
cập nhật hình ảnh sp
</commit_message>
<xml_diff>
--- a/NHẬN XÉT CỦA GIÁO VIÊN HƯỚNG DẪN.docx
+++ b/NHẬN XÉT CỦA GIÁO VIÊN HƯỚNG DẪN.docx
@@ -375,6 +375,8 @@
         </w:rPr>
         <w:tab/>
       </w:r>
+      <w:bookmarkStart w:id="4" w:name="_GoBack"/>
+      <w:bookmarkEnd w:id="4"/>
     </w:p>
     <w:p>
       <w:pPr>
@@ -386,12 +388,16 @@
         <w:rPr>
           <w:rFonts w:ascii="Times New Roman" w:hAnsi="Times New Roman" w:cs="Times New Roman"/>
           <w:i/>
+          <w:sz w:val="26"/>
+          <w:szCs w:val="26"/>
         </w:rPr>
       </w:pPr>
       <w:r>
         <w:rPr>
           <w:rFonts w:ascii="Times New Roman" w:hAnsi="Times New Roman" w:cs="Times New Roman"/>
           <w:i/>
+          <w:sz w:val="26"/>
+          <w:szCs w:val="26"/>
         </w:rPr>
         <w:t>Vĩnh Long, ngày … tháng … năm 2025</w:t>
       </w:r>
@@ -406,12 +412,16 @@
         <w:rPr>
           <w:rFonts w:ascii="Times New Roman" w:hAnsi="Times New Roman" w:cs="Times New Roman"/>
           <w:b/>
+          <w:sz w:val="26"/>
+          <w:szCs w:val="26"/>
         </w:rPr>
       </w:pPr>
       <w:r>
         <w:rPr>
           <w:rFonts w:ascii="Times New Roman" w:hAnsi="Times New Roman" w:cs="Times New Roman"/>
           <w:b/>
+          <w:sz w:val="26"/>
+          <w:szCs w:val="26"/>
         </w:rPr>
         <w:t>Giáo viên hướng dẫn</w:t>
       </w:r>
@@ -426,12 +436,16 @@
         <w:rPr>
           <w:rFonts w:ascii="Times New Roman" w:hAnsi="Times New Roman" w:cs="Times New Roman"/>
           <w:i/>
+          <w:sz w:val="26"/>
+          <w:szCs w:val="26"/>
         </w:rPr>
       </w:pPr>
       <w:r>
         <w:rPr>
           <w:rFonts w:ascii="Times New Roman" w:hAnsi="Times New Roman" w:cs="Times New Roman"/>
           <w:i/>
+          <w:sz w:val="26"/>
+          <w:szCs w:val="26"/>
         </w:rPr>
         <w:t>(Ký và ghi rõ họ tên)</w:t>
       </w:r>
@@ -466,12 +480,12 @@
       <w:pPr>
         <w:pStyle w:val="TieuDe"/>
       </w:pPr>
-      <w:bookmarkStart w:id="4" w:name="_Toc213926375"/>
+      <w:bookmarkStart w:id="5" w:name="_Toc213926375"/>
       <w:r>
         <w:lastRenderedPageBreak/>
         <w:t>NHẬN XÉT CỦA THÀNH VIÊN HỘI ĐỒNG</w:t>
       </w:r>
-      <w:bookmarkEnd w:id="4"/>
+      <w:bookmarkEnd w:id="5"/>
     </w:p>
     <w:p>
       <w:pPr>
@@ -841,12 +855,16 @@
         <w:rPr>
           <w:rFonts w:ascii="Times New Roman" w:hAnsi="Times New Roman" w:cs="Times New Roman"/>
           <w:i/>
+          <w:sz w:val="26"/>
+          <w:szCs w:val="26"/>
         </w:rPr>
       </w:pPr>
       <w:r>
         <w:rPr>
           <w:rFonts w:ascii="Times New Roman" w:hAnsi="Times New Roman" w:cs="Times New Roman"/>
           <w:i/>
+          <w:sz w:val="26"/>
+          <w:szCs w:val="26"/>
         </w:rPr>
         <w:t>Vĩnh Long, ngày … tháng … năm 2025</w:t>
       </w:r>
@@ -861,12 +879,16 @@
         <w:rPr>
           <w:rFonts w:ascii="Times New Roman" w:hAnsi="Times New Roman" w:cs="Times New Roman"/>
           <w:b/>
+          <w:sz w:val="26"/>
+          <w:szCs w:val="26"/>
         </w:rPr>
       </w:pPr>
       <w:r>
         <w:rPr>
           <w:rFonts w:ascii="Times New Roman" w:hAnsi="Times New Roman" w:cs="Times New Roman"/>
           <w:b/>
+          <w:sz w:val="26"/>
+          <w:szCs w:val="26"/>
         </w:rPr>
         <w:t>Thành viên hội đồng</w:t>
       </w:r>
@@ -881,12 +903,16 @@
         <w:rPr>
           <w:rFonts w:ascii="Times New Roman" w:hAnsi="Times New Roman" w:cs="Times New Roman"/>
           <w:i/>
+          <w:sz w:val="26"/>
+          <w:szCs w:val="26"/>
         </w:rPr>
       </w:pPr>
       <w:r>
         <w:rPr>
           <w:rFonts w:ascii="Times New Roman" w:hAnsi="Times New Roman" w:cs="Times New Roman"/>
           <w:i/>
+          <w:sz w:val="26"/>
+          <w:szCs w:val="26"/>
         </w:rPr>
         <w:t>(Ký và ghi rõ họ tên)</w:t>
       </w:r>
@@ -902,8 +928,18 @@
     <w:p>
       <w:pPr>
         <w:pStyle w:val="TieuDe"/>
-      </w:pPr>
-      <w:r>
+        <w:spacing w:before="0" w:after="0"/>
+        <w:ind w:firstLine="720"/>
+        <w:rPr>
+          <w:sz w:val="26"/>
+          <w:szCs w:val="26"/>
+        </w:rPr>
+      </w:pPr>
+      <w:r>
+        <w:rPr>
+          <w:sz w:val="26"/>
+          <w:szCs w:val="26"/>
+        </w:rPr>
         <w:lastRenderedPageBreak/>
         <w:t>LỜI CẢM ƠN</w:t>
       </w:r>
@@ -925,15 +961,7 @@
           <w:sz w:val="26"/>
           <w:szCs w:val="26"/>
         </w:rPr>
-        <w:t>Trong quá trình thực hiện đề</w:t>
-      </w:r>
-      <w:r>
-        <w:rPr>
-          <w:rFonts w:ascii="Times New Roman" w:hAnsi="Times New Roman" w:cs="Times New Roman"/>
-          <w:sz w:val="26"/>
-          <w:szCs w:val="26"/>
-        </w:rPr>
-        <w:t xml:space="preserve"> tài, </w:t>
+        <w:t xml:space="preserve">Trong quá trình thực hiện đề tài, </w:t>
       </w:r>
       <w:r>
         <w:rPr>
@@ -1185,16 +1213,7 @@
           <w:sz w:val="26"/>
           <w:szCs w:val="26"/>
         </w:rPr>
-        <w:t xml:space="preserve"> (cô</w:t>
-      </w:r>
-      <w:bookmarkStart w:id="5" w:name="_GoBack"/>
-      <w:bookmarkEnd w:id="5"/>
-      <w:r>
-        <w:rPr>
-          <w:sz w:val="26"/>
-          <w:szCs w:val="26"/>
-        </w:rPr>
-        <w:t>)</w:t>
+        <w:t xml:space="preserve"> (cô)</w:t>
       </w:r>
       <w:r>
         <w:rPr>

</xml_diff>